<commit_message>
Update: Add [Taxe Fonciere] placeholder to LOI template
- Add [Taxe Fonciere] placeholder in template Word document
- Placeholder will be automatically replaced with RECHERCHEV calculated value

🤖 Generated with [Claude Code](https://claude.com/claude-code)

Co-Authored-By: Claude Sonnet 4.5 <noreply@anthropic.com>
</commit_message>
<xml_diff>
--- a/Template LOI avec placeholder.docx
+++ b/Template LOI avec placeholder.docx
@@ -74,6 +74,7 @@
       <w:r>
         <w:t xml:space="preserve"> </w:t>
       </w:r>
+      <w:bookmarkStart w:id="0" w:name="OLE_LINK1"/>
       <w:r>
         <w:rPr>
           <w:spacing w:val="-2"/>
@@ -96,6 +97,7 @@
         </w:rPr>
         <w:t>]</w:t>
       </w:r>
+      <w:bookmarkEnd w:id="0"/>
     </w:p>
     <w:p>
       <w:pPr>
@@ -358,6 +360,7 @@
         </w:rPr>
         <w:t>[</w:t>
       </w:r>
+      <w:bookmarkStart w:id="1" w:name="OLE_LINK2"/>
       <w:r>
         <w:rPr>
           <w:sz w:val="20"/>
@@ -370,6 +373,7 @@
         </w:rPr>
         <w:t>]</w:t>
       </w:r>
+      <w:bookmarkEnd w:id="1"/>
       <w:r>
         <w:rPr>
           <w:sz w:val="20"/>
@@ -1335,7 +1339,33 @@
         <w:rPr>
           <w:sz w:val="20"/>
         </w:rPr>
-        <w:t xml:space="preserve"> : remboursée par le preneur au bailleur sur facturation spécifique, à titre informatif la TF/TEOM s’élevait à [.] € en 2025 ;</w:t>
+        <w:t xml:space="preserve"> : remboursée par le preneur au bailleur sur facturation spécifique, à titre informatif la TF/TEOM s’élevait à </w:t>
+      </w:r>
+      <w:r>
+        <w:rPr>
+          <w:sz w:val="20"/>
+        </w:rPr>
+        <w:t xml:space="preserve">[Taxe </w:t>
+      </w:r>
+      <w:proofErr w:type="spellStart"/>
+      <w:r>
+        <w:rPr>
+          <w:sz w:val="20"/>
+        </w:rPr>
+        <w:t>Fonciere</w:t>
+      </w:r>
+      <w:proofErr w:type="spellEnd"/>
+      <w:r>
+        <w:rPr>
+          <w:sz w:val="20"/>
+        </w:rPr>
+        <w:t xml:space="preserve">] </w:t>
+      </w:r>
+      <w:r>
+        <w:rPr>
+          <w:sz w:val="20"/>
+        </w:rPr>
+        <w:t xml:space="preserve"> € en 2025 ;</w:t>
       </w:r>
     </w:p>
     <w:p>

</xml_diff>